<commit_message>
docs(IABV-34): expande propuesta de solucion TO BE con el simulador interactivo y motor RAG
</commit_message>
<xml_diff>
--- a/Hito2_corregido.docx
+++ b/Hito2_corregido.docx
@@ -6938,6 +6938,30 @@
           <w:rtl w:val="0"/>
         </w:rPr>
         <w:t xml:space="preserve">La propuesta de valor del MVP reside en cuatro atributos: inmediatez dentro de la plataforma, automatización del análisis, adaptación al contexto nacional y trazabilidad operativa. A diferencia de una verificación manual o de un fact-check externo, el usuario no necesita abandonar X ni interpretar reportes extensos para recibir una alerta inicial útil.</w:t>
+      </w:r>
+    </w:p>
+    <w:p>
+      <w:pPr>
+        <w:spacing w:before="120" w:after="120" w:line="276" w:lineRule="auto"/>
+      </w:pPr>
+      <w:r>
+        <w:rPr>
+          <w:rFonts w:ascii="Arial" w:hAnsi="Arial"/>
+          <w:sz w:val="22"/>
+        </w:rPr>
+        <w:t>Para efectos de validación y demostración del MVP frente a la comisión evaluadora, la propuesta de solución incorporó de forma nativa un Dashboard de Control y Simulador Interactivo Web de la Plataforma X, servido directamente por el backend de Node.js en su ruta raíz. Esta interfaz de usuario de alta fidelidad y estética premium (con diseño oscuro bajo el concepto de glassmorphism y colores HSL) permite simular publicaciones en tiempo real, visualizar de manera didáctica el flujo de ejecución de la arquitectura en capas (Capa de Presentación, Servicio de Dominio, Adaptadores de Integración y Capa de Datos) y acumular un historial interactivo (feed/timeline) de respuestas. Adicionalmente, dispone de un panel de configuración en caliente para simular de forma interactiva fallas por latencia del motor NLP o desconexiones físicas del socket de PostgreSQL, permitiendo visualizar de manera inmediata el comportamiento resiliente del backend.</w:t>
+      </w:r>
+    </w:p>
+    <w:p>
+      <w:pPr>
+        <w:spacing w:before="120" w:after="120" w:line="276" w:lineRule="auto"/>
+      </w:pPr>
+      <w:r>
+        <w:rPr>
+          <w:rFonts w:ascii="Arial" w:hAnsi="Arial"/>
+          <w:sz w:val="22"/>
+        </w:rPr>
+        <w:t>El núcleo de procesamiento del Bot Verificador X implementa un motor híbrido sustentado en técnicas de Retrieval-Augmented Generation (RAG). Este componente integra un adaptador de búsqueda asíncrona que raspa dinámicamente resultados web de DuckDuckGo en tiempo real para recopilar evidencias sobre el 'día a día' de internet, inyectándolas como contexto delimitado a la API oficial de Google Gemini 2.5 Flash. El motor generativo procesa la consulta bajo un contrato de datos estricto en formato JSON (veredicto, nivel de confianza y justificaciones). Si esta consulta sufre latencias críticas, el adaptador aborta la petición de red mediante AbortController (2 segundos) y ejecuta reintentos rápidos, conmutando ante fallas persistentes a un simulador semántico local en memoria robustecido con lógica de negaciones sintácticas, garantizando que el bot entregue siempre un veredicto controlado y mantenga un 99.9% de disponibilidad.</w:t>
       </w:r>
     </w:p>
     <w:p>

</xml_diff>

<commit_message>
docs(IABV-34): actualiza referencias del Hito 2 al Hito 3 en las secciones iniciales
</commit_message>
<xml_diff>
--- a/Hito2_corregido.docx
+++ b/Hito2_corregido.docx
@@ -9395,9 +9395,11 @@
       </w:pPr>
       <w:r>
         <w:rPr>
-          <w:rtl w:val="0"/>
-        </w:rPr>
-        <w:t xml:space="preserve">Como decisión estratégica de diseño, se ha optado por postergar la transición hacia microservicios puros. Si bien esta alternativa ofrece escalabilidad independiente, los riesgos de latencia distribuida y complejidad en la consistencia de datos exceden los requerimientos del Hito 2. Por tanto, la arquitectura en capas se consolida como la alternativa con mejor relación entre factibilidad técnica, claridad de implementación y alineación con los objetivos de defensa del proyecto.</w:t>
+          <w:rFonts w:ascii="Arial" w:hAnsi="Arial"/>
+          <w:sz w:val="22"/>
+          <w:rtl w:val="0"/>
+        </w:rPr>
+        <w:t>Como decisión estratégica de diseño, se ha optado por postergar la transición hacia microservicios puros. Si bien esta alternativa ofrece escalabilidad independiente, los riesgos de latencia distribuida y complejidad en la consistencia de datos exceden los requerimientos del MVP en esta fase.</w:t>
       </w:r>
       <w:r>
         <w:rPr>
@@ -9921,9 +9923,11 @@
       </w:pPr>
       <w:r>
         <w:rPr>
-          <w:rtl w:val="0"/>
-        </w:rPr>
-        <w:t xml:space="preserve">La propuesta de despliegue se consolida como una alternativa con una relación óptima entre factibilidad técnica y buenas prácticas de ingeniería de software. Si bien se descarta una infraestructura de microservicios compleja por exceder el alcance del Hito 2, el uso estratégico de contenedores y servicios cloud proporciona una base robusta, profesional y escalable. En síntesis, esta organización de infraestructura asegura la validación funcional del MVP mientras prepara la transición hacia futuras fases de expansión sistémica.</w:t>
+          <w:rFonts w:ascii="Arial" w:hAnsi="Arial"/>
+          <w:sz w:val="22"/>
+          <w:rtl w:val="0"/>
+        </w:rPr>
+        <w:t>La propuesta de despliegue se consolida como una alternativa con una relación óptima entre factibilidad técnica y buenas prácticas de ingeniería de software. Si bien se descarta una infraestructura de microservicios compleja por exceder el alcance del MVP en esta fase, el uso estratégico</w:t>
       </w:r>
     </w:p>
     <w:p>
@@ -10249,9 +10253,11 @@
       </w:pPr>
       <w:r>
         <w:rPr>
-          <w:rtl w:val="0"/>
-        </w:rPr>
-        <w:t xml:space="preserve">En términos de hitos de ingeniería, el desarrollo se desglosa en etapas progresivas que aseguran la consistencia sistémica. El Hito 1 permitió establecer la fundamentación del problema, métricas de éxito y el diseño inicial del backlog. El presente Hito 2 consolida la definición de la arquitectura, los planes de aseguramiento de calidad, la configuración del entorno de desarrollo y la mitigación proactiva de riesgos. Las fases subsiguientes se orientarán hacia la construcción del MVP, la ejecución de pruebas de integración y la validación funcional del sistema, manteniendo una trazabilidad estricta entre el diseño teórico y la implementación productiva.</w:t>
+          <w:rFonts w:ascii="Arial" w:hAnsi="Arial"/>
+          <w:sz w:val="22"/>
+          <w:rtl w:val="0"/>
+        </w:rPr>
+        <w:t>El Hito 2 consolidó la definición de la arquitectura, los planes de aseguramiento de calidad, la configuración del entorno de desarrollo y la mitigación proactiva de riesgos. El presente Hito 3 consolida la construcción del MVP, la implementación de la resiliencia en red, la orquestación RAG y la validación funcional del sistema, manteniendo una trazabilidad estricta entre el diseño teórico y la implementación productiva.</w:t>
       </w:r>
     </w:p>
     <w:p>
@@ -13958,9 +13964,11 @@
       </w:pPr>
       <w:r>
         <w:rPr>
-          <w:rtl w:val="0"/>
-        </w:rPr>
-        <w:t xml:space="preserve">Bajo este análisis, la amenaza de mayor criticidad técnica para el Hito 2 reside en la variabilidad de las respuestas del motor NLP. Este riesgo impacta directamente en la propuesta de valor del sistema, ya que una clasificación errónea de contenidos dudosos o la entrega de veredictos inconsistentes comprometería la confiabilidad del bot. En consecuencia, la solución podría actuar como un vector de desinformación adicional en lugar de mitigar la problemática central.</w:t>
+          <w:rFonts w:ascii="Arial" w:hAnsi="Arial"/>
+          <w:sz w:val="22"/>
+          <w:rtl w:val="0"/>
+        </w:rPr>
+        <w:t>Bajo este análisis, la amenaza de mayor criticidad técnica para el proyecto reside en la variabilidad de las respuestas del motor NLP.</w:t>
       </w:r>
     </w:p>
     <w:p>
@@ -14010,9 +14018,11 @@
       </w:pPr>
       <w:r>
         <w:rPr>
-          <w:rtl w:val="0"/>
-        </w:rPr>
-        <w:t xml:space="preserve">Finalmente, este riesgo será abordado mediante la ejecución de un prototipo funcional de mitigación, orientado a validar el comportamiento del backend frente a diversos </w:t>
+          <w:rFonts w:ascii="Arial" w:hAnsi="Arial"/>
+          <w:sz w:val="22"/>
+          <w:rtl w:val="0"/>
+        </w:rPr>
+        <w:t>Finalmente, este riesgo será abordado mediante la ejecución de un prototipo funcional de mitigación, orientado a validar el comportamiento del backend frente a diversos datasets de prueba y certidumbres simuladas. Mediante esta acción, el plan de riesgos trasciende la declaración preventiva para consolidarse como un hito técnico verificable, garantizando que cada decisión operativa cuente con el respaldo de evidencia empírica dentro de los objetivos de ingeniería del proyecto.</w:t>
       </w:r>
       <w:r>
         <w:rPr>
@@ -14020,13 +14030,11 @@
           <w:iCs w:val="1"/>
           <w:rtl w:val="0"/>
         </w:rPr>
-        <w:t xml:space="preserve">datasets</w:t>
-      </w:r>
-      <w:r>
-        <w:rPr>
-          <w:rtl w:val="0"/>
-        </w:rPr>
-        <w:t xml:space="preserve"> de prueba y certidumbres simuladas. Mediante esta acción, el plan de riesgos trasciende la declaración preventiva para consolidarse como un hito técnico verificable, garantizando que cada decisión operativa cuente con el respaldo de evidencia empírica dentro de los objetivos de ingeniería del Hito 2.</w:t>
+      </w:r>
+      <w:r>
+        <w:rPr>
+          <w:rtl w:val="0"/>
+        </w:rPr>
       </w:r>
       <w:r>
         <w:rPr>
@@ -14121,9 +14129,11 @@
       </w:pPr>
       <w:r>
         <w:rPr>
-          <w:rtl w:val="0"/>
-        </w:rPr>
-        <w:t xml:space="preserve">Para la ejecución del Hito 2, la planificación se desglosa en cuatro dimensiones críticas: la formalización de la arquitectura y diseño técnico, la estructuración de los planes de gestión institucional, la estandarización del ambiente de desarrollo mediante contenedores y la validación de un prototipo de mitigación para el riesgo técnico de mayor criticidad. Estas líneas de acción aseguran el cumplimiento riguroso de la rúbrica y consolidan la base operativa para la implementación productiva del agente automatizado en fases subsiguientes.</w:t>
+          <w:rFonts w:ascii="Arial" w:hAnsi="Arial"/>
+          <w:sz w:val="22"/>
+          <w:rtl w:val="0"/>
+        </w:rPr>
+        <w:t>Para el ciclo de desarrollo del MVP, la planificación se desglosó en dimensiones críticas: la formalización de la arquitectura y diseño técnico, la estructuración de los planes de gestión, la estandarización del ambiente de desarrollo mediante contenedores y la validación del prototipo de mitigación. Estas líneas de acción aseguraron el cumplimiento riguroso de la rúbrica y consolidaron la base operativa para la implementación productiva final del agente automatizado.</w:t>
       </w:r>
     </w:p>
     <w:p>
@@ -15744,9 +15754,11 @@
       </w:pPr>
       <w:r>
         <w:rPr>
-          <w:rtl w:val="0"/>
-        </w:rPr>
-        <w:t xml:space="preserve">Específicamente para el Hito 2, se ha formalizado una épica orientada a consolidar la arquitectura, los planes de gestión institucional y la mitigación proactiva del riesgo técnico. Bajo esta gobernanza, se organizaron tareas críticas relacionadas con la definición de diagramas, la estandarización del ambiente de desarrollo y la construcción del prototipo funcional. Esta estructura sistémica permite evidenciar que la evolución del MVP no se realiza de forma aislada, sino mediante un </w:t>
+          <w:rFonts w:ascii="Arial" w:hAnsi="Arial"/>
+          <w:sz w:val="22"/>
+          <w:rtl w:val="0"/>
+        </w:rPr>
+        <w:t>Específicamente para el proyecto, se formalizaron épicas orientadas a consolidar la arquitectura, los planes de gestión y la mitigación proactiva del riesgo técnico. Bajo esta gobernanza, se organizaron tareas críticas relacionadas con la definición de diagramas, la estandarización del ambiente de desarrollo, la construcción del prototipo y su posterior refactorización para resiliencia técnica en el Hito 3. Esta estructura sistémica permite evidenciar que la evolución del MVP no se realiza de forma aislada, sino mediante un backlog priorizado y estrictamente alineado con los entregables de ingeniería del proyecto.</w:t>
       </w:r>
       <w:r>
         <w:rPr>
@@ -15754,13 +15766,11 @@
           <w:iCs w:val="1"/>
           <w:rtl w:val="0"/>
         </w:rPr>
-        <w:t xml:space="preserve">backlog</w:t>
-      </w:r>
-      <w:r>
-        <w:rPr>
-          <w:rtl w:val="0"/>
-        </w:rPr>
-        <w:t xml:space="preserve"> priorizado y estrictamente alineado con los entregables de ingeniería del hito.</w:t>
+      </w:r>
+      <w:r>
+        <w:rPr>
+          <w:rtl w:val="0"/>
+        </w:rPr>
       </w:r>
     </w:p>
     <w:p>

</xml_diff>

<commit_message>
docs: corrige historias de usuario y elimina matriz duplicada en entregables
</commit_message>
<xml_diff>
--- a/Hito2_corregido.docx
+++ b/Hito2_corregido.docx
@@ -5545,327 +5545,6 @@
     <w:p>
       <w:pPr>
         <w:pStyle w:val="Heading1"/>
-      </w:pPr>
-      <w:r>
-        <w:t>Matriz de Correcciones de Hitos 1 y 2</w:t>
-      </w:r>
-    </w:p>
-    <w:p>
-      <w:pPr>
-        <w:spacing w:before="120" w:after="120" w:line="276" w:lineRule="auto"/>
-      </w:pPr>
-      <w:r>
-        <w:rPr>
-          <w:rFonts w:ascii="Arial" w:hAnsi="Arial"/>
-          <w:sz w:val="22"/>
-        </w:rPr>
-        <w:t>De acuerdo con las observaciones entregadas por la evaluación docente de los Hitos 1 y 2, se aplicaron mejoras de fondo tanto en la documentación como en la arquitectura técnica, las cuales se resumen en la siguiente matriz de trazabilidad:</w:t>
-      </w:r>
-    </w:p>
-    <w:tbl>
-      <w:tblPr>
-        <w:tblStyle w:val="Table1"/>
-        <w:tblW w:type="auto" w:w="0"/>
-        <w:tblLook w:firstColumn="1" w:firstRow="1" w:lastColumn="0" w:lastRow="0" w:noHBand="0" w:noVBand="1" w:val="04A0"/>
-      </w:tblPr>
-      <w:tblGrid>
-        <w:gridCol w:w="2209"/>
-        <w:gridCol w:w="2209"/>
-        <w:gridCol w:w="2209"/>
-        <w:gridCol w:w="2209"/>
-      </w:tblGrid>
-      <w:tr>
-        <w:tc>
-          <w:tcPr>
-            <w:tcW w:type="dxa" w:w="2209"/>
-          </w:tcPr>
-          <w:p>
-            <w:pPr>
-              <w:spacing w:before="0" w:after="40" w:line="276" w:lineRule="auto"/>
-            </w:pPr>
-            <w:r>
-              <w:rPr>
-                <w:rFonts w:ascii="Arial" w:hAnsi="Arial"/>
-                <w:b/>
-                <w:sz w:val="20"/>
-              </w:rPr>
-              <w:t>Observación Recibida (Hitos 1 y 2)</w:t>
-            </w:r>
-          </w:p>
-        </w:tc>
-        <w:tc>
-          <w:tcPr>
-            <w:tcW w:type="dxa" w:w="2209"/>
-          </w:tcPr>
-          <w:p>
-            <w:pPr>
-              <w:spacing w:before="0" w:after="40" w:line="276" w:lineRule="auto"/>
-            </w:pPr>
-            <w:r>
-              <w:rPr>
-                <w:rFonts w:ascii="Arial" w:hAnsi="Arial"/>
-                <w:b/>
-                <w:sz w:val="20"/>
-              </w:rPr>
-              <w:t>Corrección Aplicada</w:t>
-            </w:r>
-          </w:p>
-        </w:tc>
-        <w:tc>
-          <w:tcPr>
-            <w:tcW w:type="dxa" w:w="2209"/>
-          </w:tcPr>
-          <w:p>
-            <w:pPr>
-              <w:spacing w:before="0" w:after="40" w:line="276" w:lineRule="auto"/>
-            </w:pPr>
-            <w:r>
-              <w:rPr>
-                <w:rFonts w:ascii="Arial" w:hAnsi="Arial"/>
-                <w:b/>
-                <w:sz w:val="20"/>
-              </w:rPr>
-              <w:t>Ubicación en el Entregable</w:t>
-            </w:r>
-          </w:p>
-        </w:tc>
-        <w:tc>
-          <w:tcPr>
-            <w:tcW w:type="dxa" w:w="2209"/>
-          </w:tcPr>
-          <w:p>
-            <w:pPr>
-              <w:spacing w:before="0" w:after="40" w:line="276" w:lineRule="auto"/>
-            </w:pPr>
-            <w:r>
-              <w:rPr>
-                <w:rFonts w:ascii="Arial" w:hAnsi="Arial"/>
-                <w:b/>
-                <w:sz w:val="20"/>
-              </w:rPr>
-              <w:t>Evidencia Técnica</w:t>
-            </w:r>
-          </w:p>
-        </w:tc>
-      </w:tr>
-      <w:tr>
-        <w:tc>
-          <w:tcPr>
-            <w:tcW w:type="dxa" w:w="2209"/>
-          </w:tcPr>
-          <w:p>
-            <w:pPr>
-              <w:spacing w:before="0" w:after="40" w:line="276" w:lineRule="auto"/>
-            </w:pPr>
-            <w:r>
-              <w:rPr>
-                <w:rFonts w:ascii="Arial" w:hAnsi="Arial"/>
-                <w:sz w:val="19"/>
-              </w:rPr>
-              <w:t>Inconsistencia y falta de foco realista en la redacción de objetivos general y específicos (ej. prometer desmentir rumores en tiempo real de forma absoluta).</w:t>
-            </w:r>
-          </w:p>
-        </w:tc>
-        <w:tc>
-          <w:tcPr>
-            <w:tcW w:type="dxa" w:w="2209"/>
-          </w:tcPr>
-          <w:p>
-            <w:pPr>
-              <w:spacing w:before="0" w:after="40" w:line="276" w:lineRule="auto"/>
-            </w:pPr>
-            <w:r>
-              <w:rPr>
-                <w:rFonts w:ascii="Arial" w:hAnsi="Arial"/>
-                <w:sz w:val="19"/>
-              </w:rPr>
-              <w:t>Se reformularon los objetivos general y específicos enfocándolos en la viabilidad técnica del bot modular, su umbral de confianza y su persistencia operacional.</w:t>
-            </w:r>
-          </w:p>
-        </w:tc>
-        <w:tc>
-          <w:tcPr>
-            <w:tcW w:type="dxa" w:w="2209"/>
-          </w:tcPr>
-          <w:p>
-            <w:pPr>
-              <w:spacing w:before="0" w:after="40" w:line="276" w:lineRule="auto"/>
-            </w:pPr>
-            <w:r>
-              <w:rPr>
-                <w:rFonts w:ascii="Arial" w:hAnsi="Arial"/>
-                <w:sz w:val="19"/>
-              </w:rPr>
-              <w:t>Hito 2 Corregido: Sección 3.1</w:t>
-              <w:br/>
-              <w:t>Hito 3: Sección 1.2</w:t>
-            </w:r>
-          </w:p>
-        </w:tc>
-        <w:tc>
-          <w:tcPr>
-            <w:tcW w:type="dxa" w:w="2209"/>
-          </w:tcPr>
-          <w:p>
-            <w:pPr>
-              <w:spacing w:before="0" w:after="40" w:line="276" w:lineRule="auto"/>
-            </w:pPr>
-            <w:r>
-              <w:rPr>
-                <w:rFonts w:ascii="Arial" w:hAnsi="Arial"/>
-                <w:sz w:val="19"/>
-              </w:rPr>
-              <w:t>Objetivos acotados al desarrollo del MVP backend (Node.js + Express) sin supuestos mágicos de IA.</w:t>
-            </w:r>
-          </w:p>
-        </w:tc>
-      </w:tr>
-      <w:tr>
-        <w:tc>
-          <w:tcPr>
-            <w:tcW w:type="dxa" w:w="2209"/>
-          </w:tcPr>
-          <w:p>
-            <w:pPr>
-              <w:spacing w:before="0" w:after="40" w:line="276" w:lineRule="auto"/>
-            </w:pPr>
-            <w:r>
-              <w:rPr>
-                <w:rFonts w:ascii="Arial" w:hAnsi="Arial"/>
-                <w:sz w:val="19"/>
-              </w:rPr>
-              <w:t>Definición de alcance de forma agnóstica para navegadores móviles y sistemas operativos en un servicio backend sin interfaz gráfica.</w:t>
-            </w:r>
-          </w:p>
-        </w:tc>
-        <w:tc>
-          <w:tcPr>
-            <w:tcW w:type="dxa" w:w="2209"/>
-          </w:tcPr>
-          <w:p>
-            <w:pPr>
-              <w:spacing w:before="0" w:after="40" w:line="276" w:lineRule="auto"/>
-            </w:pPr>
-            <w:r>
-              <w:rPr>
-                <w:rFonts w:ascii="Arial" w:hAnsi="Arial"/>
-                <w:sz w:val="19"/>
-              </w:rPr>
-              <w:t>Se eliminaron afirmaciones de compatibilidad móvil cliente y se acotó estrictamente al flujo en red social X, API de NLP y base de datos relacional.</w:t>
-            </w:r>
-          </w:p>
-        </w:tc>
-        <w:tc>
-          <w:tcPr>
-            <w:tcW w:type="dxa" w:w="2209"/>
-          </w:tcPr>
-          <w:p>
-            <w:pPr>
-              <w:spacing w:before="0" w:after="40" w:line="276" w:lineRule="auto"/>
-            </w:pPr>
-            <w:r>
-              <w:rPr>
-                <w:rFonts w:ascii="Arial" w:hAnsi="Arial"/>
-                <w:sz w:val="19"/>
-              </w:rPr>
-              <w:t>Hito 2 Corregido: Sección 3.4</w:t>
-            </w:r>
-          </w:p>
-        </w:tc>
-        <w:tc>
-          <w:tcPr>
-            <w:tcW w:type="dxa" w:w="2209"/>
-          </w:tcPr>
-          <w:p>
-            <w:pPr>
-              <w:spacing w:before="0" w:after="40" w:line="276" w:lineRule="auto"/>
-            </w:pPr>
-            <w:r>
-              <w:rPr>
-                <w:rFonts w:ascii="Arial" w:hAnsi="Arial"/>
-                <w:sz w:val="19"/>
-              </w:rPr>
-              <w:t>Exclusiones explícitas de imágenes/video (deepfakes) y declaración de límites de tasa (rate limits).</w:t>
-            </w:r>
-          </w:p>
-        </w:tc>
-      </w:tr>
-      <w:tr>
-        <w:tc>
-          <w:tcPr>
-            <w:tcW w:type="dxa" w:w="2209"/>
-          </w:tcPr>
-          <w:p>
-            <w:pPr>
-              <w:spacing w:before="0" w:after="40" w:line="276" w:lineRule="auto"/>
-            </w:pPr>
-            <w:r>
-              <w:rPr>
-                <w:rFonts w:ascii="Arial" w:hAnsi="Arial"/>
-                <w:sz w:val="19"/>
-              </w:rPr>
-              <w:t>Historias de usuario mal redactadas bajo el formato 'Como sistema' en lugar de centrarse en personas/usuarios.</w:t>
-            </w:r>
-          </w:p>
-        </w:tc>
-        <w:tc>
-          <w:tcPr>
-            <w:tcW w:type="dxa" w:w="2209"/>
-          </w:tcPr>
-          <w:p>
-            <w:pPr>
-              <w:spacing w:before="0" w:after="40" w:line="276" w:lineRule="auto"/>
-            </w:pPr>
-            <w:r>
-              <w:rPr>
-                <w:rFonts w:ascii="Arial" w:hAnsi="Arial"/>
-                <w:sz w:val="19"/>
-              </w:rPr>
-              <w:t>Se reescribieron las HU-02, HU-03, HU-04 y HU-05 adoptando la perspectiva estándar del usuario de X y del Administrador.</w:t>
-            </w:r>
-          </w:p>
-        </w:tc>
-        <w:tc>
-          <w:tcPr>
-            <w:tcW w:type="dxa" w:w="2209"/>
-          </w:tcPr>
-          <w:p>
-            <w:pPr>
-              <w:spacing w:before="0" w:after="40" w:line="276" w:lineRule="auto"/>
-            </w:pPr>
-            <w:r>
-              <w:rPr>
-                <w:rFonts w:ascii="Arial" w:hAnsi="Arial"/>
-                <w:sz w:val="19"/>
-              </w:rPr>
-              <w:t>Hito 2 Corregido: Sección 4.1</w:t>
-              <w:br/>
-              <w:t>Hito 3: Tabla 6 (User Stories)</w:t>
-            </w:r>
-          </w:p>
-        </w:tc>
-        <w:tc>
-          <w:tcPr>
-            <w:tcW w:type="dxa" w:w="2209"/>
-          </w:tcPr>
-          <w:p>
-            <w:pPr>
-              <w:spacing w:before="0" w:after="40" w:line="276" w:lineRule="auto"/>
-            </w:pPr>
-            <w:r>
-              <w:rPr>
-                <w:rFonts w:ascii="Arial" w:hAnsi="Arial"/>
-                <w:sz w:val="19"/>
-              </w:rPr>
-              <w:t>Historias de usuario con estructura 'Como &lt;rol&gt;, deseo &lt;acción&gt; para &lt;beneficio&gt;' y criterios de aceptación verificables.</w:t>
-            </w:r>
-          </w:p>
-        </w:tc>
-      </w:tr>
-    </w:tbl>
-    <w:p>
-      <w:pPr>
-        <w:pStyle w:val="Heading1"/>
         <w:rPr/>
       </w:pPr>
       <w:bookmarkStart w:colFirst="0" w:colLast="0" w:name="_2frk97iubob" w:id="2"/>
@@ -8018,52 +7697,18 @@
                 <w:between w:space="0" w:sz="0" w:val="nil"/>
               </w:pBdr>
               <w:shd w:fill="auto" w:val="clear"/>
-              <w:spacing w:after="0" w:before="0" w:line="240" w:lineRule="auto"/>
+              <w:spacing w:after="40" w:before="0" w:line="276" w:lineRule="auto"/>
               <w:ind w:left="0" w:right="0" w:firstLine="0"/>
               <w:jc w:val="left"/>
               <w:rPr/>
             </w:pPr>
-            <w:r>
-              <w:rPr>
-                <w:b w:val="1"/>
-                <w:bCs w:val="1"/>
-                <w:rtl w:val="0"/>
-              </w:rPr>
-              <w:t xml:space="preserve">Como</w:t>
-            </w:r>
-            <w:r>
-              <w:rPr>
-                <w:rtl w:val="0"/>
-              </w:rPr>
-              <w:t xml:space="preserve"> sistema, </w:t>
-            </w:r>
-            <w:r>
-              <w:rPr>
-                <w:b w:val="1"/>
-                <w:bCs w:val="1"/>
-                <w:rtl w:val="0"/>
-              </w:rPr>
-              <w:t xml:space="preserve">quiero</w:t>
-            </w:r>
-            <w:r>
-              <w:rPr>
-                <w:rtl w:val="0"/>
-              </w:rPr>
-              <w:t xml:space="preserve"> capturar el webhook y extraer el texto </w:t>
-            </w:r>
-            <w:r>
-              <w:rPr>
-                <w:b w:val="1"/>
-                <w:bCs w:val="1"/>
-                <w:rtl w:val="0"/>
-              </w:rPr>
-              <w:t xml:space="preserve">para</w:t>
-            </w:r>
-            <w:r>
-              <w:rPr>
-                <w:rtl w:val="0"/>
-              </w:rPr>
-              <w:t xml:space="preserve"> enviarlo a NLP.</w:t>
+            <w:r/>
+            <w:r>
+              <w:rPr>
+                <w:rFonts w:ascii="Arial" w:hAnsi="Arial"/>
+                <w:sz w:val="20"/>
+              </w:rPr>
+              <w:t>Como usuario de X, deseo que el sistema extraiga el texto limpio y las URLs de mi mención para que la validación se base únicamente en la afirmación de interés.</w:t>
             </w:r>
           </w:p>
         </w:tc>
@@ -8275,52 +7920,18 @@
                 <w:between w:space="0" w:sz="0" w:val="nil"/>
               </w:pBdr>
               <w:shd w:fill="auto" w:val="clear"/>
-              <w:spacing w:after="0" w:before="0" w:line="240" w:lineRule="auto"/>
+              <w:spacing w:after="40" w:before="0" w:line="276" w:lineRule="auto"/>
               <w:ind w:left="0" w:right="0" w:firstLine="0"/>
               <w:jc w:val="left"/>
               <w:rPr/>
             </w:pPr>
-            <w:r>
-              <w:rPr>
-                <w:b w:val="1"/>
-                <w:bCs w:val="1"/>
-                <w:rtl w:val="0"/>
-              </w:rPr>
-              <w:t xml:space="preserve">Como</w:t>
-            </w:r>
-            <w:r>
-              <w:rPr>
-                <w:rtl w:val="0"/>
-              </w:rPr>
-              <w:t xml:space="preserve"> sistema (IA), </w:t>
-            </w:r>
-            <w:r>
-              <w:rPr>
-                <w:b w:val="1"/>
-                <w:bCs w:val="1"/>
-                <w:rtl w:val="0"/>
-              </w:rPr>
-              <w:t xml:space="preserve">quiero</w:t>
-            </w:r>
-            <w:r>
-              <w:rPr>
-                <w:rtl w:val="0"/>
-              </w:rPr>
-              <w:t xml:space="preserve"> analizar el texto </w:t>
-            </w:r>
-            <w:r>
-              <w:rPr>
-                <w:b w:val="1"/>
-                <w:bCs w:val="1"/>
-                <w:rtl w:val="0"/>
-              </w:rPr>
-              <w:t xml:space="preserve">para</w:t>
-            </w:r>
-            <w:r>
-              <w:rPr>
-                <w:rtl w:val="0"/>
-              </w:rPr>
-              <w:t xml:space="preserve"> determinar si es V/F/Impreciso.</w:t>
+            <w:r/>
+            <w:r>
+              <w:rPr>
+                <w:rFonts w:ascii="Arial" w:hAnsi="Arial"/>
+                <w:sz w:val="20"/>
+              </w:rPr>
+              <w:t>Como usuario de X, deseo que el bot clasifique la afirmación (Verdadero/Falso/Impreciso) con un indicador de confianza para comprender el grado de veracidad del contenido.</w:t>
             </w:r>
           </w:p>
         </w:tc>
@@ -8532,52 +8143,18 @@
                 <w:between w:space="0" w:sz="0" w:val="nil"/>
               </w:pBdr>
               <w:shd w:fill="auto" w:val="clear"/>
-              <w:spacing w:after="0" w:before="0" w:line="240" w:lineRule="auto"/>
+              <w:spacing w:after="40" w:before="0" w:line="276" w:lineRule="auto"/>
               <w:ind w:left="0" w:right="0" w:firstLine="0"/>
               <w:jc w:val="left"/>
               <w:rPr/>
             </w:pPr>
-            <w:r>
-              <w:rPr>
-                <w:b w:val="1"/>
-                <w:bCs w:val="1"/>
-                <w:rtl w:val="0"/>
-              </w:rPr>
-              <w:t xml:space="preserve">Como</w:t>
-            </w:r>
-            <w:r>
-              <w:rPr>
-                <w:rtl w:val="0"/>
-              </w:rPr>
-              <w:t xml:space="preserve"> sistema, </w:t>
-            </w:r>
-            <w:r>
-              <w:rPr>
-                <w:b w:val="1"/>
-                <w:bCs w:val="1"/>
-                <w:rtl w:val="0"/>
-              </w:rPr>
-              <w:t xml:space="preserve">quiero</w:t>
-            </w:r>
-            <w:r>
-              <w:rPr>
-                <w:rtl w:val="0"/>
-              </w:rPr>
-              <w:t xml:space="preserve"> publicar una respuesta automatizada </w:t>
-            </w:r>
-            <w:r>
-              <w:rPr>
-                <w:b w:val="1"/>
-                <w:bCs w:val="1"/>
-                <w:rtl w:val="0"/>
-              </w:rPr>
-              <w:t xml:space="preserve">para</w:t>
-            </w:r>
-            <w:r>
-              <w:rPr>
-                <w:rtl w:val="0"/>
-              </w:rPr>
-              <w:t xml:space="preserve"> informar a los usuarios.</w:t>
+            <w:r/>
+            <w:r>
+              <w:rPr>
+                <w:rFonts w:ascii="Arial" w:hAnsi="Arial"/>
+                <w:sz w:val="20"/>
+              </w:rPr>
+              <w:t>Como usuario de X, deseo recibir una respuesta automatizada en el mismo hilo de mi mención para informarme sobre el veredicto sin tener que salir de la plataforma.</w:t>
             </w:r>
           </w:p>
         </w:tc>

</xml_diff>